<commit_message>
fazendo a query da pergunta 4
</commit_message>
<xml_diff>
--- a/Questao4/Questão 4.docx
+++ b/Questao4/Questão 4.docx
@@ -1,6 +1,6 @@
 
 <file path=word/document.xml><?xml version="1.0" encoding="utf-8"?>
-<w:document xmlns:wpc="http://schemas.microsoft.com/office/word/2010/wordprocessingCanvas" xmlns:cx="http://schemas.microsoft.com/office/drawing/2014/chartex" xmlns:cx1="http://schemas.microsoft.com/office/drawing/2015/9/8/chartex" xmlns:cx2="http://schemas.microsoft.com/office/drawing/2015/10/21/chartex" xmlns:cx3="http://schemas.microsoft.com/office/drawing/2016/5/9/chartex" xmlns:cx4="http://schemas.microsoft.com/office/drawing/2016/5/10/chartex" xmlns:cx5="http://schemas.microsoft.com/office/drawing/2016/5/11/chartex" xmlns:cx6="http://schemas.microsoft.com/office/drawing/2016/5/12/chartex" xmlns:cx7="http://schemas.microsoft.com/office/drawing/2016/5/13/chartex" xmlns:cx8="http://schemas.microsoft.com/office/drawing/2016/5/14/chartex" xmlns:mc="http://schemas.openxmlformats.org/markup-compatibility/2006" xmlns:aink="http://schemas.microsoft.com/office/drawing/2016/ink" xmlns:am3d="http://schemas.microsoft.com/office/drawing/2017/model3d" xmlns:o="urn:schemas-microsoft-com:office:office" xmlns:r="http://schemas.openxmlformats.org/officeDocument/2006/relationships" xmlns:m="http://schemas.openxmlformats.org/officeDocument/2006/math" xmlns:v="urn:schemas-microsoft-com:vml" xmlns:wp14="http://schemas.microsoft.com/office/word/2010/wordprocessingDrawing" xmlns:wp="http://schemas.openxmlformats.org/drawingml/2006/wordprocessingDrawing" xmlns:w10="urn:schemas-microsoft-com:office:word" xmlns:w="http://schemas.openxmlformats.org/wordprocessingml/2006/main" xmlns:w14="http://schemas.microsoft.com/office/word/2010/wordml" xmlns:w15="http://schemas.microsoft.com/office/word/2012/wordml" xmlns:w16cex="http://schemas.microsoft.com/office/word/2018/wordml/cex" xmlns:w16cid="http://schemas.microsoft.com/office/word/2016/wordml/cid" xmlns:w16="http://schemas.microsoft.com/office/word/2018/wordml" xmlns:w16sdtdh="http://schemas.microsoft.com/office/word/2020/wordml/sdtdatahash" xmlns:w16se="http://schemas.microsoft.com/office/word/2015/wordml/symex" xmlns:wpg="http://schemas.microsoft.com/office/word/2010/wordprocessingGroup" xmlns:wpi="http://schemas.microsoft.com/office/word/2010/wordprocessingInk" xmlns:wne="http://schemas.microsoft.com/office/word/2006/wordml" xmlns:wps="http://schemas.microsoft.com/office/word/2010/wordprocessingShape" mc:Ignorable="w14 w15 w16se w16cid w16 w16cex w16sdtdh wp14">
+<w:document xmlns:wpc="http://schemas.microsoft.com/office/word/2010/wordprocessingCanvas" xmlns:cx="http://schemas.microsoft.com/office/drawing/2014/chartex" xmlns:cx1="http://schemas.microsoft.com/office/drawing/2015/9/8/chartex" xmlns:cx2="http://schemas.microsoft.com/office/drawing/2015/10/21/chartex" xmlns:cx3="http://schemas.microsoft.com/office/drawing/2016/5/9/chartex" xmlns:cx4="http://schemas.microsoft.com/office/drawing/2016/5/10/chartex" xmlns:cx5="http://schemas.microsoft.com/office/drawing/2016/5/11/chartex" xmlns:cx6="http://schemas.microsoft.com/office/drawing/2016/5/12/chartex" xmlns:cx7="http://schemas.microsoft.com/office/drawing/2016/5/13/chartex" xmlns:cx8="http://schemas.microsoft.com/office/drawing/2016/5/14/chartex" xmlns:mc="http://schemas.openxmlformats.org/markup-compatibility/2006" xmlns:aink="http://schemas.microsoft.com/office/drawing/2016/ink" xmlns:am3d="http://schemas.microsoft.com/office/drawing/2017/model3d" xmlns:o="urn:schemas-microsoft-com:office:office" xmlns:oel="http://schemas.microsoft.com/office/2019/extlst" xmlns:r="http://schemas.openxmlformats.org/officeDocument/2006/relationships" xmlns:m="http://schemas.openxmlformats.org/officeDocument/2006/math" xmlns:v="urn:schemas-microsoft-com:vml" xmlns:wp14="http://schemas.microsoft.com/office/word/2010/wordprocessingDrawing" xmlns:wp="http://schemas.openxmlformats.org/drawingml/2006/wordprocessingDrawing" xmlns:w10="urn:schemas-microsoft-com:office:word" xmlns:w="http://schemas.openxmlformats.org/wordprocessingml/2006/main" xmlns:w14="http://schemas.microsoft.com/office/word/2010/wordml" xmlns:w15="http://schemas.microsoft.com/office/word/2012/wordml" xmlns:w16cex="http://schemas.microsoft.com/office/word/2018/wordml/cex" xmlns:w16cid="http://schemas.microsoft.com/office/word/2016/wordml/cid" xmlns:w16="http://schemas.microsoft.com/office/word/2018/wordml" xmlns:w16du="http://schemas.microsoft.com/office/word/2023/wordml/word16du" xmlns:w16sdtdh="http://schemas.microsoft.com/office/word/2020/wordml/sdtdatahash" xmlns:w16sdtfl="http://schemas.microsoft.com/office/word/2024/wordml/sdtformatlock" xmlns:w16se="http://schemas.microsoft.com/office/word/2015/wordml/symex" xmlns:wpg="http://schemas.microsoft.com/office/word/2010/wordprocessingGroup" xmlns:wpi="http://schemas.microsoft.com/office/word/2010/wordprocessingInk" xmlns:wne="http://schemas.microsoft.com/office/word/2006/wordml" xmlns:wps="http://schemas.microsoft.com/office/word/2010/wordprocessingShape" mc:Ignorable="w14 w15 w16se w16cid w16 w16cex w16sdtdh w16sdtfl w16du wp14">
   <w:body>
     <w:p>
       <w:pPr>
@@ -509,7 +509,6 @@
               </w:rPr>
               <w:t xml:space="preserve"> </w:t>
             </w:r>
-            <w:proofErr w:type="gramStart"/>
             <w:r>
               <w:rPr>
                 <w:rFonts w:ascii="Courier New" w:hAnsi="Courier New" w:cs="Courier New"/>
@@ -540,7 +539,6 @@
               </w:rPr>
               <w:t>RAW</w:t>
             </w:r>
-            <w:proofErr w:type="gramEnd"/>
             <w:r>
               <w:rPr>
                 <w:rFonts w:ascii="Courier New" w:hAnsi="Courier New" w:cs="Courier New"/>
@@ -5410,6 +5408,271 @@
         <w:t xml:space="preserve"> </w:t>
       </w:r>
     </w:p>
+    <w:p>
+      <w:r>
+        <w:t>Resposta na próxima pagina</w:t>
+      </w:r>
+      <w:r>
+        <w:br w:type="page"/>
+      </w:r>
+    </w:p>
+    <w:p/>
+    <w:p>
+      <w:pPr>
+        <w:autoSpaceDE w:val="0"/>
+        <w:autoSpaceDN w:val="0"/>
+        <w:adjustRightInd w:val="0"/>
+      </w:pPr>
+    </w:p>
+    <w:tbl>
+      <w:tblPr>
+        <w:tblStyle w:val="Tabelacomgrade"/>
+        <w:tblW w:w="0" w:type="auto"/>
+        <w:tblLook w:val="04A0" w:firstRow="1" w:lastRow="0" w:firstColumn="1" w:lastColumn="0" w:noHBand="0" w:noVBand="1"/>
+      </w:tblPr>
+      <w:tblGrid>
+        <w:gridCol w:w="10456"/>
+      </w:tblGrid>
+      <w:tr>
+        <w:tc>
+          <w:tcPr>
+            <w:tcW w:w="10456" w:type="dxa"/>
+          </w:tcPr>
+          <w:p>
+            <w:pPr>
+              <w:autoSpaceDE w:val="0"/>
+              <w:autoSpaceDN w:val="0"/>
+              <w:adjustRightInd w:val="0"/>
+            </w:pPr>
+            <w:r>
+              <w:t xml:space="preserve">SELECT </w:t>
+            </w:r>
+          </w:p>
+          <w:p>
+            <w:pPr>
+              <w:autoSpaceDE w:val="0"/>
+              <w:autoSpaceDN w:val="0"/>
+              <w:adjustRightInd w:val="0"/>
+            </w:pPr>
+            <w:r>
+              <w:t xml:space="preserve">    assunto, </w:t>
+            </w:r>
+          </w:p>
+          <w:p>
+            <w:pPr>
+              <w:autoSpaceDE w:val="0"/>
+              <w:autoSpaceDN w:val="0"/>
+              <w:adjustRightInd w:val="0"/>
+            </w:pPr>
+            <w:r>
+              <w:t xml:space="preserve">    ano, </w:t>
+            </w:r>
+          </w:p>
+          <w:p>
+            <w:pPr>
+              <w:autoSpaceDE w:val="0"/>
+              <w:autoSpaceDN w:val="0"/>
+              <w:adjustRightInd w:val="0"/>
+            </w:pPr>
+            <w:r>
+              <w:t xml:space="preserve">    COUNT(*) AS quantidade</w:t>
+            </w:r>
+          </w:p>
+          <w:p>
+            <w:pPr>
+              <w:autoSpaceDE w:val="0"/>
+              <w:autoSpaceDN w:val="0"/>
+              <w:adjustRightInd w:val="0"/>
+            </w:pPr>
+            <w:r>
+              <w:t xml:space="preserve">FROM </w:t>
+            </w:r>
+          </w:p>
+          <w:p>
+            <w:pPr>
+              <w:autoSpaceDE w:val="0"/>
+              <w:autoSpaceDN w:val="0"/>
+              <w:adjustRightInd w:val="0"/>
+            </w:pPr>
+            <w:r>
+              <w:t xml:space="preserve">    atendimentos</w:t>
+            </w:r>
+          </w:p>
+          <w:p>
+            <w:pPr>
+              <w:autoSpaceDE w:val="0"/>
+              <w:autoSpaceDN w:val="0"/>
+              <w:adjustRightInd w:val="0"/>
+            </w:pPr>
+            <w:r>
+              <w:t xml:space="preserve">GROUP BY </w:t>
+            </w:r>
+          </w:p>
+          <w:p>
+            <w:pPr>
+              <w:autoSpaceDE w:val="0"/>
+              <w:autoSpaceDN w:val="0"/>
+              <w:adjustRightInd w:val="0"/>
+            </w:pPr>
+            <w:r>
+              <w:t xml:space="preserve">    assunto, ano</w:t>
+            </w:r>
+          </w:p>
+          <w:p>
+            <w:pPr>
+              <w:autoSpaceDE w:val="0"/>
+              <w:autoSpaceDN w:val="0"/>
+              <w:adjustRightInd w:val="0"/>
+              <w:rPr>
+                <w:lang w:val="en-US"/>
+              </w:rPr>
+            </w:pPr>
+            <w:r>
+              <w:rPr>
+                <w:lang w:val="en-US"/>
+              </w:rPr>
+              <w:t xml:space="preserve">HAVING </w:t>
+            </w:r>
+          </w:p>
+          <w:p>
+            <w:pPr>
+              <w:autoSpaceDE w:val="0"/>
+              <w:autoSpaceDN w:val="0"/>
+              <w:adjustRightInd w:val="0"/>
+              <w:rPr>
+                <w:lang w:val="en-US"/>
+              </w:rPr>
+            </w:pPr>
+            <w:r>
+              <w:rPr>
+                <w:lang w:val="en-US"/>
+              </w:rPr>
+              <w:t xml:space="preserve">    COUNT(*) &gt; 3</w:t>
+            </w:r>
+          </w:p>
+          <w:p>
+            <w:pPr>
+              <w:autoSpaceDE w:val="0"/>
+              <w:autoSpaceDN w:val="0"/>
+              <w:adjustRightInd w:val="0"/>
+              <w:rPr>
+                <w:lang w:val="en-US"/>
+              </w:rPr>
+            </w:pPr>
+            <w:r>
+              <w:rPr>
+                <w:lang w:val="en-US"/>
+              </w:rPr>
+              <w:t xml:space="preserve">ORDER BY </w:t>
+            </w:r>
+          </w:p>
+          <w:p>
+            <w:pPr>
+              <w:autoSpaceDE w:val="0"/>
+              <w:autoSpaceDN w:val="0"/>
+              <w:adjustRightInd w:val="0"/>
+              <w:rPr>
+                <w:lang w:val="en-US"/>
+              </w:rPr>
+            </w:pPr>
+            <w:r>
+              <w:rPr>
+                <w:lang w:val="en-US"/>
+              </w:rPr>
+              <w:t xml:space="preserve">    </w:t>
+            </w:r>
+            <w:proofErr w:type="spellStart"/>
+            <w:r>
+              <w:rPr>
+                <w:lang w:val="en-US"/>
+              </w:rPr>
+              <w:t>ano</w:t>
+            </w:r>
+            <w:proofErr w:type="spellEnd"/>
+            <w:r>
+              <w:rPr>
+                <w:lang w:val="en-US"/>
+              </w:rPr>
+              <w:t xml:space="preserve"> DESC, </w:t>
+            </w:r>
+            <w:proofErr w:type="spellStart"/>
+            <w:r>
+              <w:rPr>
+                <w:lang w:val="en-US"/>
+              </w:rPr>
+              <w:t>quantidade</w:t>
+            </w:r>
+            <w:proofErr w:type="spellEnd"/>
+            <w:r>
+              <w:rPr>
+                <w:lang w:val="en-US"/>
+              </w:rPr>
+              <w:t xml:space="preserve"> DESC;</w:t>
+            </w:r>
+          </w:p>
+        </w:tc>
+      </w:tr>
+    </w:tbl>
+    <w:p>
+      <w:pPr>
+        <w:autoSpaceDE w:val="0"/>
+        <w:autoSpaceDN w:val="0"/>
+        <w:adjustRightInd w:val="0"/>
+        <w:rPr>
+          <w:lang w:val="en-US"/>
+        </w:rPr>
+      </w:pPr>
+    </w:p>
+    <w:p>
+      <w:pPr>
+        <w:autoSpaceDE w:val="0"/>
+        <w:autoSpaceDN w:val="0"/>
+        <w:adjustRightInd w:val="0"/>
+        <w:rPr>
+          <w:lang w:val="en-US"/>
+        </w:rPr>
+      </w:pPr>
+      <w:r>
+        <w:rPr>
+          <w:lang w:val="en-US"/>
+        </w:rPr>
+        <w:drawing>
+          <wp:inline distT="0" distB="0" distL="0" distR="0" wp14:anchorId="07D449E6" wp14:editId="531F7FEE">
+            <wp:extent cx="6645910" cy="3940810"/>
+            <wp:effectExtent l="0" t="0" r="2540" b="2540"/>
+            <wp:docPr id="2055303748" name="Imagem 1" descr="Interface gráfica do usuário, Aplicativo&#10;&#10;O conteúdo gerado por IA pode estar incorreto."/>
+            <wp:cNvGraphicFramePr>
+              <a:graphicFrameLocks xmlns:a="http://schemas.openxmlformats.org/drawingml/2006/main" noChangeAspect="1"/>
+            </wp:cNvGraphicFramePr>
+            <a:graphic xmlns:a="http://schemas.openxmlformats.org/drawingml/2006/main">
+              <a:graphicData uri="http://schemas.openxmlformats.org/drawingml/2006/picture">
+                <pic:pic xmlns:pic="http://schemas.openxmlformats.org/drawingml/2006/picture">
+                  <pic:nvPicPr>
+                    <pic:cNvPr id="2055303748" name="Imagem 1" descr="Interface gráfica do usuário, Aplicativo&#10;&#10;O conteúdo gerado por IA pode estar incorreto."/>
+                    <pic:cNvPicPr/>
+                  </pic:nvPicPr>
+                  <pic:blipFill>
+                    <a:blip r:embed="rId6"/>
+                    <a:stretch>
+                      <a:fillRect/>
+                    </a:stretch>
+                  </pic:blipFill>
+                  <pic:spPr>
+                    <a:xfrm>
+                      <a:off x="0" y="0"/>
+                      <a:ext cx="6645910" cy="3940810"/>
+                    </a:xfrm>
+                    <a:prstGeom prst="rect">
+                      <a:avLst/>
+                    </a:prstGeom>
+                  </pic:spPr>
+                </pic:pic>
+              </a:graphicData>
+            </a:graphic>
+          </wp:inline>
+        </w:drawing>
+      </w:r>
+    </w:p>
     <w:sectPr>
       <w:pgSz w:w="11906" w:h="16838"/>
       <w:pgMar w:top="720" w:right="720" w:bottom="720" w:left="720" w:header="709" w:footer="709" w:gutter="0"/>
@@ -5421,7 +5684,7 @@
 </file>
 
 <file path=word/styles.xml><?xml version="1.0" encoding="utf-8"?>
-<w:styles xmlns:mc="http://schemas.openxmlformats.org/markup-compatibility/2006" xmlns:r="http://schemas.openxmlformats.org/officeDocument/2006/relationships" xmlns:w="http://schemas.openxmlformats.org/wordprocessingml/2006/main" xmlns:w14="http://schemas.microsoft.com/office/word/2010/wordml" xmlns:w15="http://schemas.microsoft.com/office/word/2012/wordml" xmlns:w16cex="http://schemas.microsoft.com/office/word/2018/wordml/cex" xmlns:w16cid="http://schemas.microsoft.com/office/word/2016/wordml/cid" xmlns:w16="http://schemas.microsoft.com/office/word/2018/wordml" xmlns:w16sdtdh="http://schemas.microsoft.com/office/word/2020/wordml/sdtdatahash" xmlns:w16se="http://schemas.microsoft.com/office/word/2015/wordml/symex" mc:Ignorable="w14 w15 w16se w16cid w16 w16cex w16sdtdh">
+<w:styles xmlns:mc="http://schemas.openxmlformats.org/markup-compatibility/2006" xmlns:r="http://schemas.openxmlformats.org/officeDocument/2006/relationships" xmlns:w="http://schemas.openxmlformats.org/wordprocessingml/2006/main" xmlns:w14="http://schemas.microsoft.com/office/word/2010/wordml" xmlns:w15="http://schemas.microsoft.com/office/word/2012/wordml" xmlns:w16cex="http://schemas.microsoft.com/office/word/2018/wordml/cex" xmlns:w16cid="http://schemas.microsoft.com/office/word/2016/wordml/cid" xmlns:w16="http://schemas.microsoft.com/office/word/2018/wordml" xmlns:w16du="http://schemas.microsoft.com/office/word/2023/wordml/word16du" xmlns:w16sdtdh="http://schemas.microsoft.com/office/word/2020/wordml/sdtdatahash" xmlns:w16sdtfl="http://schemas.microsoft.com/office/word/2024/wordml/sdtformatlock" xmlns:w16se="http://schemas.microsoft.com/office/word/2015/wordml/symex" mc:Ignorable="w14 w15 w16se w16cid w16 w16cex w16sdtdh w16sdtfl w16du">
   <w:docDefaults>
     <w:rPrDefault>
       <w:rPr>

</xml_diff>